<commit_message>
clase sobre listas por comprensión
</commit_message>
<xml_diff>
--- a/3_paciales/2_parcial/parcial_2_3.docx
+++ b/3_paciales/2_parcial/parcial_2_3.docx
@@ -94,36 +94,15 @@
         </w:numPr>
       </w:pPr>
       <w:r>
-        <w:t xml:space="preserve">Evite el uso de funciones predefinidas de Python como </w:t>
-      </w:r>
-      <w:proofErr w:type="gramStart"/>
-      <w:r>
-        <w:t>sum(</w:t>
-      </w:r>
-      <w:proofErr w:type="gramEnd"/>
-      <w:r>
-        <w:t xml:space="preserve">), </w:t>
+        <w:t xml:space="preserve">Evite el uso de funciones predefinidas de Python como sum(), </w:t>
       </w:r>
       <w:proofErr w:type="spellStart"/>
-      <w:proofErr w:type="gramStart"/>
       <w:r>
         <w:t>max</w:t>
       </w:r>
       <w:proofErr w:type="spellEnd"/>
       <w:r>
-        <w:t>(</w:t>
-      </w:r>
-      <w:proofErr w:type="gramEnd"/>
-      <w:r>
-        <w:t xml:space="preserve">) o </w:t>
-      </w:r>
-      <w:proofErr w:type="gramStart"/>
-      <w:r>
-        <w:t>min(</w:t>
-      </w:r>
-      <w:proofErr w:type="gramEnd"/>
-      <w:r>
-        <w:t>) para demostrar dominio de las estructuras de control (bucles y condicionales).</w:t>
+        <w:t>() o min() para demostrar dominio de las estructuras de control (bucles y condicionales).</w:t>
       </w:r>
     </w:p>
     <w:p>
@@ -245,8 +224,14 @@
         <w:t xml:space="preserve"> de la circunferencia (x^2 + y^2 &gt; R^2).</w:t>
       </w:r>
     </w:p>
-    <w:p>
-      <w:r>
+    <w:p/>
+    <w:p/>
+    <w:p/>
+    <w:p/>
+    <w:p/>
+    <w:p>
+      <w:r>
+        <w:lastRenderedPageBreak/>
         <w:pict w14:anchorId="27A474C2">
           <v:rect id="_x0000_i1027" style="width:0;height:1.5pt" o:hralign="center" o:hrstd="t" o:hrnoshade="t" o:hr="t" fillcolor="gray" stroked="f"/>
         </w:pict>
@@ -259,252 +244,531 @@
           <w:bCs/>
         </w:rPr>
       </w:pPr>
-    </w:p>
-    <w:p>
-      <w:pPr>
-        <w:rPr>
-          <w:b/>
-          <w:bCs/>
-        </w:rPr>
-      </w:pPr>
-    </w:p>
-    <w:p>
-      <w:pPr>
-        <w:rPr>
-          <w:b/>
-          <w:bCs/>
-        </w:rPr>
-      </w:pPr>
-    </w:p>
-    <w:p>
-      <w:pPr>
-        <w:rPr>
-          <w:b/>
-          <w:bCs/>
-        </w:rPr>
-      </w:pPr>
-    </w:p>
-    <w:p>
-      <w:pPr>
-        <w:rPr>
-          <w:b/>
-          <w:bCs/>
-        </w:rPr>
-      </w:pPr>
-    </w:p>
-    <w:p>
-      <w:pPr>
-        <w:rPr>
-          <w:b/>
-          <w:bCs/>
-        </w:rPr>
-      </w:pPr>
-    </w:p>
-    <w:p>
-      <w:pPr>
-        <w:rPr>
-          <w:b/>
-          <w:bCs/>
-        </w:rPr>
-      </w:pPr>
-    </w:p>
-    <w:p>
-      <w:pPr>
-        <w:rPr>
-          <w:b/>
-          <w:bCs/>
-        </w:rPr>
-      </w:pPr>
-    </w:p>
-    <w:p>
-      <w:pPr>
-        <w:rPr>
-          <w:b/>
-          <w:bCs/>
-        </w:rPr>
-      </w:pPr>
-    </w:p>
-    <w:p>
-      <w:pPr>
-        <w:rPr>
-          <w:b/>
-          <w:bCs/>
-        </w:rPr>
-      </w:pPr>
-    </w:p>
-    <w:p>
-      <w:pPr>
-        <w:rPr>
-          <w:b/>
-          <w:bCs/>
-        </w:rPr>
-      </w:pPr>
-    </w:p>
-    <w:p>
-      <w:pPr>
-        <w:rPr>
-          <w:b/>
-          <w:bCs/>
-        </w:rPr>
-      </w:pPr>
-    </w:p>
-    <w:p>
-      <w:pPr>
-        <w:rPr>
-          <w:b/>
-          <w:bCs/>
-        </w:rPr>
-      </w:pPr>
-    </w:p>
-    <w:p>
-      <w:pPr>
-        <w:rPr>
-          <w:b/>
-          <w:bCs/>
-        </w:rPr>
-      </w:pPr>
-    </w:p>
-    <w:p>
-      <w:pPr>
-        <w:rPr>
-          <w:b/>
-          <w:bCs/>
-        </w:rPr>
-      </w:pPr>
-    </w:p>
-    <w:p>
-      <w:pPr>
-        <w:rPr>
-          <w:b/>
-          <w:bCs/>
-        </w:rPr>
-      </w:pPr>
-    </w:p>
-    <w:p>
-      <w:pPr>
-        <w:rPr>
-          <w:b/>
-          <w:bCs/>
-        </w:rPr>
-      </w:pPr>
-    </w:p>
-    <w:p>
-      <w:pPr>
-        <w:rPr>
-          <w:b/>
-          <w:bCs/>
-        </w:rPr>
-      </w:pPr>
-    </w:p>
-    <w:p>
-      <w:pPr>
-        <w:rPr>
-          <w:b/>
-          <w:bCs/>
-        </w:rPr>
-      </w:pPr>
-    </w:p>
-    <w:p>
-      <w:pPr>
-        <w:rPr>
-          <w:b/>
-          <w:bCs/>
-        </w:rPr>
-      </w:pPr>
-    </w:p>
-    <w:p>
-      <w:pPr>
-        <w:rPr>
-          <w:b/>
-          <w:bCs/>
-        </w:rPr>
-      </w:pPr>
-    </w:p>
-    <w:p>
-      <w:pPr>
-        <w:rPr>
-          <w:b/>
-          <w:bCs/>
-        </w:rPr>
-      </w:pPr>
-    </w:p>
-    <w:p>
-      <w:pPr>
-        <w:rPr>
-          <w:b/>
-          <w:bCs/>
-        </w:rPr>
-      </w:pPr>
-    </w:p>
-    <w:p>
-      <w:pPr>
-        <w:rPr>
-          <w:b/>
-          <w:bCs/>
-        </w:rPr>
-      </w:pPr>
-    </w:p>
-    <w:p>
-      <w:pPr>
-        <w:rPr>
-          <w:b/>
-          <w:bCs/>
-        </w:rPr>
-      </w:pPr>
-    </w:p>
-    <w:p>
-      <w:pPr>
-        <w:rPr>
-          <w:b/>
-          <w:bCs/>
-        </w:rPr>
-      </w:pPr>
-    </w:p>
-    <w:p>
-      <w:pPr>
-        <w:rPr>
-          <w:b/>
-          <w:bCs/>
-        </w:rPr>
-      </w:pPr>
-    </w:p>
-    <w:p>
-      <w:pPr>
-        <w:rPr>
-          <w:b/>
-          <w:bCs/>
-        </w:rPr>
-      </w:pPr>
-    </w:p>
-    <w:p>
-      <w:pPr>
-        <w:rPr>
-          <w:b/>
-          <w:bCs/>
-        </w:rPr>
-      </w:pPr>
-    </w:p>
-    <w:p>
-      <w:pPr>
-        <w:rPr>
-          <w:b/>
-          <w:bCs/>
-        </w:rPr>
-      </w:pPr>
-    </w:p>
-    <w:p>
-      <w:pPr>
-        <w:rPr>
-          <w:b/>
-          <w:bCs/>
-        </w:rPr>
-      </w:pPr>
-      <w:r>
-        <w:rPr>
-          <w:b/>
-          <w:bCs/>
-        </w:rPr>
-        <w:lastRenderedPageBreak/>
+      <w:proofErr w:type="spellStart"/>
+      <w:r>
+        <w:rPr>
+          <w:b/>
+          <w:bCs/>
+        </w:rPr>
+        <w:t>def</w:t>
+      </w:r>
+      <w:proofErr w:type="spellEnd"/>
+      <w:r>
+        <w:rPr>
+          <w:b/>
+          <w:bCs/>
+        </w:rPr>
+        <w:t xml:space="preserve"> </w:t>
+      </w:r>
+      <w:proofErr w:type="spellStart"/>
+      <w:r>
+        <w:rPr>
+          <w:b/>
+          <w:bCs/>
+        </w:rPr>
+        <w:t>posicion_punto</w:t>
+      </w:r>
+      <w:proofErr w:type="spellEnd"/>
+      <w:r>
+        <w:rPr>
+          <w:b/>
+          <w:bCs/>
+        </w:rPr>
+        <w:t xml:space="preserve">(x, y, R): </w:t>
+      </w:r>
+    </w:p>
+    <w:p>
+      <w:pPr>
+        <w:rPr>
+          <w:b/>
+          <w:bCs/>
+        </w:rPr>
+      </w:pPr>
+      <w:r>
+        <w:rPr>
+          <w:b/>
+          <w:bCs/>
+        </w:rPr>
+        <w:t>    valor = x**2 + y**2</w:t>
+      </w:r>
+    </w:p>
+    <w:p>
+      <w:pPr>
+        <w:rPr>
+          <w:b/>
+          <w:bCs/>
+        </w:rPr>
+      </w:pPr>
+      <w:r>
+        <w:rPr>
+          <w:b/>
+          <w:bCs/>
+        </w:rPr>
+        <w:t>    R_2 = R**2</w:t>
+      </w:r>
+    </w:p>
+    <w:p>
+      <w:pPr>
+        <w:rPr>
+          <w:b/>
+          <w:bCs/>
+        </w:rPr>
+      </w:pPr>
+      <w:r>
+        <w:rPr>
+          <w:b/>
+          <w:bCs/>
+        </w:rPr>
+        <w:t xml:space="preserve">    </w:t>
+      </w:r>
+      <w:proofErr w:type="spellStart"/>
+      <w:r>
+        <w:rPr>
+          <w:b/>
+          <w:bCs/>
+        </w:rPr>
+        <w:t>if</w:t>
+      </w:r>
+      <w:proofErr w:type="spellEnd"/>
+      <w:r>
+        <w:rPr>
+          <w:b/>
+          <w:bCs/>
+        </w:rPr>
+        <w:t xml:space="preserve"> valor &lt; R_2:</w:t>
+      </w:r>
+    </w:p>
+    <w:p>
+      <w:pPr>
+        <w:rPr>
+          <w:b/>
+          <w:bCs/>
+        </w:rPr>
+      </w:pPr>
+      <w:r>
+        <w:rPr>
+          <w:b/>
+          <w:bCs/>
+        </w:rPr>
+        <w:t xml:space="preserve">        </w:t>
+      </w:r>
+      <w:proofErr w:type="spellStart"/>
+      <w:r>
+        <w:rPr>
+          <w:b/>
+          <w:bCs/>
+        </w:rPr>
+        <w:t>return</w:t>
+      </w:r>
+      <w:proofErr w:type="spellEnd"/>
+      <w:r>
+        <w:rPr>
+          <w:b/>
+          <w:bCs/>
+        </w:rPr>
+        <w:t xml:space="preserve"> "Dentro"</w:t>
+      </w:r>
+    </w:p>
+    <w:p>
+      <w:pPr>
+        <w:rPr>
+          <w:b/>
+          <w:bCs/>
+        </w:rPr>
+      </w:pPr>
+      <w:r>
+        <w:rPr>
+          <w:b/>
+          <w:bCs/>
+        </w:rPr>
+        <w:t xml:space="preserve">    </w:t>
+      </w:r>
+      <w:proofErr w:type="spellStart"/>
+      <w:r>
+        <w:rPr>
+          <w:b/>
+          <w:bCs/>
+        </w:rPr>
+        <w:t>elif</w:t>
+      </w:r>
+      <w:proofErr w:type="spellEnd"/>
+      <w:r>
+        <w:rPr>
+          <w:b/>
+          <w:bCs/>
+        </w:rPr>
+        <w:t xml:space="preserve"> valor == R_2:</w:t>
+      </w:r>
+    </w:p>
+    <w:p>
+      <w:pPr>
+        <w:rPr>
+          <w:b/>
+          <w:bCs/>
+        </w:rPr>
+      </w:pPr>
+      <w:r>
+        <w:rPr>
+          <w:b/>
+          <w:bCs/>
+        </w:rPr>
+        <w:t xml:space="preserve">        </w:t>
+      </w:r>
+      <w:proofErr w:type="spellStart"/>
+      <w:r>
+        <w:rPr>
+          <w:b/>
+          <w:bCs/>
+        </w:rPr>
+        <w:t>return</w:t>
+      </w:r>
+      <w:proofErr w:type="spellEnd"/>
+      <w:r>
+        <w:rPr>
+          <w:b/>
+          <w:bCs/>
+        </w:rPr>
+        <w:t xml:space="preserve"> "Sobre la circunferencia"</w:t>
+      </w:r>
+    </w:p>
+    <w:p>
+      <w:pPr>
+        <w:rPr>
+          <w:b/>
+          <w:bCs/>
+        </w:rPr>
+      </w:pPr>
+      <w:r>
+        <w:rPr>
+          <w:b/>
+          <w:bCs/>
+        </w:rPr>
+        <w:t xml:space="preserve">    </w:t>
+      </w:r>
+      <w:proofErr w:type="spellStart"/>
+      <w:r>
+        <w:rPr>
+          <w:b/>
+          <w:bCs/>
+        </w:rPr>
+        <w:t>else</w:t>
+      </w:r>
+      <w:proofErr w:type="spellEnd"/>
+      <w:r>
+        <w:rPr>
+          <w:b/>
+          <w:bCs/>
+        </w:rPr>
+        <w:t>:  </w:t>
+      </w:r>
+    </w:p>
+    <w:p>
+      <w:pPr>
+        <w:rPr>
+          <w:b/>
+          <w:bCs/>
+        </w:rPr>
+      </w:pPr>
+      <w:r>
+        <w:rPr>
+          <w:b/>
+          <w:bCs/>
+        </w:rPr>
+        <w:t xml:space="preserve">        </w:t>
+      </w:r>
+      <w:proofErr w:type="spellStart"/>
+      <w:r>
+        <w:rPr>
+          <w:b/>
+          <w:bCs/>
+        </w:rPr>
+        <w:t>return</w:t>
+      </w:r>
+      <w:proofErr w:type="spellEnd"/>
+      <w:r>
+        <w:rPr>
+          <w:b/>
+          <w:bCs/>
+        </w:rPr>
+        <w:t xml:space="preserve"> "Fuera"</w:t>
+      </w:r>
+    </w:p>
+    <w:p>
+      <w:pPr>
+        <w:rPr>
+          <w:b/>
+          <w:bCs/>
+        </w:rPr>
+      </w:pPr>
+    </w:p>
+    <w:p>
+      <w:pPr>
+        <w:rPr>
+          <w:b/>
+          <w:bCs/>
+        </w:rPr>
+      </w:pPr>
+      <w:proofErr w:type="spellStart"/>
+      <w:r>
+        <w:rPr>
+          <w:b/>
+          <w:bCs/>
+        </w:rPr>
+        <w:t>posicion_punto</w:t>
+      </w:r>
+      <w:proofErr w:type="spellEnd"/>
+      <w:r>
+        <w:rPr>
+          <w:b/>
+          <w:bCs/>
+        </w:rPr>
+        <w:t>(1, 1, 2)</w:t>
+      </w:r>
+    </w:p>
+    <w:p>
+      <w:pPr>
+        <w:rPr>
+          <w:b/>
+          <w:bCs/>
+        </w:rPr>
+      </w:pPr>
+    </w:p>
+    <w:p>
+      <w:pPr>
+        <w:rPr>
+          <w:b/>
+          <w:bCs/>
+        </w:rPr>
+      </w:pPr>
+    </w:p>
+    <w:p>
+      <w:pPr>
+        <w:rPr>
+          <w:b/>
+          <w:bCs/>
+        </w:rPr>
+      </w:pPr>
+    </w:p>
+    <w:p>
+      <w:pPr>
+        <w:rPr>
+          <w:b/>
+          <w:bCs/>
+        </w:rPr>
+      </w:pPr>
+    </w:p>
+    <w:p>
+      <w:pPr>
+        <w:rPr>
+          <w:b/>
+          <w:bCs/>
+        </w:rPr>
+      </w:pPr>
+    </w:p>
+    <w:p>
+      <w:pPr>
+        <w:rPr>
+          <w:b/>
+          <w:bCs/>
+        </w:rPr>
+      </w:pPr>
+    </w:p>
+    <w:p>
+      <w:pPr>
+        <w:rPr>
+          <w:b/>
+          <w:bCs/>
+        </w:rPr>
+      </w:pPr>
+    </w:p>
+    <w:p>
+      <w:pPr>
+        <w:rPr>
+          <w:b/>
+          <w:bCs/>
+        </w:rPr>
+      </w:pPr>
+    </w:p>
+    <w:p>
+      <w:pPr>
+        <w:rPr>
+          <w:b/>
+          <w:bCs/>
+        </w:rPr>
+      </w:pPr>
+    </w:p>
+    <w:p>
+      <w:pPr>
+        <w:rPr>
+          <w:b/>
+          <w:bCs/>
+        </w:rPr>
+      </w:pPr>
+    </w:p>
+    <w:p>
+      <w:pPr>
+        <w:rPr>
+          <w:b/>
+          <w:bCs/>
+        </w:rPr>
+      </w:pPr>
+    </w:p>
+    <w:p>
+      <w:pPr>
+        <w:rPr>
+          <w:b/>
+          <w:bCs/>
+        </w:rPr>
+      </w:pPr>
+    </w:p>
+    <w:p>
+      <w:pPr>
+        <w:rPr>
+          <w:b/>
+          <w:bCs/>
+        </w:rPr>
+      </w:pPr>
+    </w:p>
+    <w:p>
+      <w:pPr>
+        <w:rPr>
+          <w:b/>
+          <w:bCs/>
+        </w:rPr>
+      </w:pPr>
+    </w:p>
+    <w:p>
+      <w:pPr>
+        <w:rPr>
+          <w:b/>
+          <w:bCs/>
+        </w:rPr>
+      </w:pPr>
+    </w:p>
+    <w:p>
+      <w:pPr>
+        <w:rPr>
+          <w:b/>
+          <w:bCs/>
+        </w:rPr>
+      </w:pPr>
+    </w:p>
+    <w:p>
+      <w:pPr>
+        <w:rPr>
+          <w:b/>
+          <w:bCs/>
+        </w:rPr>
+      </w:pPr>
+    </w:p>
+    <w:p>
+      <w:pPr>
+        <w:rPr>
+          <w:b/>
+          <w:bCs/>
+        </w:rPr>
+      </w:pPr>
+    </w:p>
+    <w:p>
+      <w:pPr>
+        <w:rPr>
+          <w:b/>
+          <w:bCs/>
+        </w:rPr>
+      </w:pPr>
+    </w:p>
+    <w:p>
+      <w:pPr>
+        <w:rPr>
+          <w:b/>
+          <w:bCs/>
+        </w:rPr>
+      </w:pPr>
+    </w:p>
+    <w:p>
+      <w:pPr>
+        <w:rPr>
+          <w:b/>
+          <w:bCs/>
+        </w:rPr>
+      </w:pPr>
+    </w:p>
+    <w:p>
+      <w:pPr>
+        <w:rPr>
+          <w:b/>
+          <w:bCs/>
+        </w:rPr>
+      </w:pPr>
+    </w:p>
+    <w:p>
+      <w:pPr>
+        <w:rPr>
+          <w:b/>
+          <w:bCs/>
+        </w:rPr>
+      </w:pPr>
+    </w:p>
+    <w:p>
+      <w:pPr>
+        <w:rPr>
+          <w:b/>
+          <w:bCs/>
+        </w:rPr>
+      </w:pPr>
+    </w:p>
+    <w:p>
+      <w:pPr>
+        <w:rPr>
+          <w:b/>
+          <w:bCs/>
+        </w:rPr>
+      </w:pPr>
+    </w:p>
+    <w:p>
+      <w:pPr>
+        <w:rPr>
+          <w:b/>
+          <w:bCs/>
+        </w:rPr>
+      </w:pPr>
+    </w:p>
+    <w:p>
+      <w:pPr>
+        <w:rPr>
+          <w:b/>
+          <w:bCs/>
+        </w:rPr>
+      </w:pPr>
+    </w:p>
+    <w:p>
+      <w:pPr>
+        <w:rPr>
+          <w:b/>
+          <w:bCs/>
+        </w:rPr>
+      </w:pPr>
+    </w:p>
+    <w:p>
+      <w:pPr>
+        <w:rPr>
+          <w:b/>
+          <w:bCs/>
+        </w:rPr>
+      </w:pPr>
+    </w:p>
+    <w:p>
+      <w:pPr>
+        <w:rPr>
+          <w:b/>
+          <w:bCs/>
+        </w:rPr>
+      </w:pPr>
+      <w:r>
+        <w:rPr>
+          <w:b/>
+          <w:bCs/>
+        </w:rPr>
         <w:t>2. Cálculo Numérico (</w:t>
       </w:r>
       <w:proofErr w:type="spellStart"/>
@@ -751,7 +1015,6 @@
           <w:b/>
           <w:bCs/>
         </w:rPr>
-        <w:lastRenderedPageBreak/>
         <w:t>3. Estadística para Ciencia de Datos (</w:t>
       </w:r>
       <w:proofErr w:type="spellStart"/>
@@ -999,7 +1262,6 @@
           <w:b/>
           <w:bCs/>
         </w:rPr>
-        <w:lastRenderedPageBreak/>
         <w:t>4. Álgebra Lineal: Transformaciones (Funciones)</w:t>
       </w:r>
     </w:p>
@@ -1023,15 +1285,7 @@
           <w:b/>
           <w:bCs/>
         </w:rPr>
-        <w:t>rotar_</w:t>
-      </w:r>
-      <w:proofErr w:type="gramStart"/>
-      <w:r>
-        <w:rPr>
-          <w:b/>
-          <w:bCs/>
-        </w:rPr>
-        <w:t>vector</w:t>
+        <w:t>rotar_vector</w:t>
       </w:r>
       <w:proofErr w:type="spellEnd"/>
       <w:r>
@@ -1039,15 +1293,7 @@
           <w:b/>
           <w:bCs/>
         </w:rPr>
-        <w:t>(</w:t>
-      </w:r>
-      <w:proofErr w:type="gramEnd"/>
-      <w:r>
-        <w:rPr>
-          <w:b/>
-          <w:bCs/>
-        </w:rPr>
-        <w:t xml:space="preserve">x, y, </w:t>
+        <w:t xml:space="preserve">(x, y, </w:t>
       </w:r>
       <w:proofErr w:type="spellStart"/>
       <w:r>
@@ -1246,7 +1492,6 @@
         <w:t xml:space="preserve">' solo para usar </w:t>
       </w:r>
       <w:proofErr w:type="spellStart"/>
-      <w:proofErr w:type="gramStart"/>
       <w:r>
         <w:rPr>
           <w:i/>
@@ -1260,40 +1505,23 @@
           <w:i/>
           <w:iCs/>
         </w:rPr>
-        <w:t>(</w:t>
-      </w:r>
-      <w:proofErr w:type="gramEnd"/>
+        <w:t xml:space="preserve">() y </w:t>
+      </w:r>
+      <w:proofErr w:type="spellStart"/>
       <w:r>
         <w:rPr>
           <w:i/>
           <w:iCs/>
         </w:rPr>
-        <w:t xml:space="preserve">) y </w:t>
-      </w:r>
-      <w:proofErr w:type="spellStart"/>
-      <w:proofErr w:type="gramStart"/>
+        <w:t>math.cos</w:t>
+      </w:r>
+      <w:proofErr w:type="spellEnd"/>
       <w:r>
         <w:rPr>
           <w:i/>
           <w:iCs/>
         </w:rPr>
-        <w:t>math.cos</w:t>
-      </w:r>
-      <w:proofErr w:type="spellEnd"/>
-      <w:r>
-        <w:rPr>
-          <w:i/>
-          <w:iCs/>
-        </w:rPr>
-        <w:t>(</w:t>
-      </w:r>
-      <w:proofErr w:type="gramEnd"/>
-      <w:r>
-        <w:rPr>
-          <w:i/>
-          <w:iCs/>
-        </w:rPr>
-        <w:t>))</w:t>
+        <w:t>())</w:t>
       </w:r>
       <w:r>
         <w:t>.</w:t>
@@ -1438,7 +1666,6 @@
           <w:b/>
           <w:bCs/>
         </w:rPr>
-        <w:lastRenderedPageBreak/>
         <w:t>5. Procesamiento de Señales / Series (Funciones y Lógica)</w:t>
       </w:r>
     </w:p>
@@ -1452,15 +1679,7 @@
           <w:b/>
           <w:bCs/>
         </w:rPr>
-        <w:t>limpiar_</w:t>
-      </w:r>
-      <w:proofErr w:type="gramStart"/>
-      <w:r>
-        <w:rPr>
-          <w:b/>
-          <w:bCs/>
-        </w:rPr>
-        <w:t>datos</w:t>
+        <w:t>limpiar_datos</w:t>
       </w:r>
       <w:proofErr w:type="spellEnd"/>
       <w:r>
@@ -1471,7 +1690,6 @@
         <w:t>(</w:t>
       </w:r>
       <w:proofErr w:type="spellStart"/>
-      <w:proofErr w:type="gramEnd"/>
       <w:r>
         <w:rPr>
           <w:b/>
@@ -2932,7 +3150,6 @@
   <w:style w:type="character" w:default="1" w:styleId="Fuentedeprrafopredeter">
     <w:name w:val="Default Paragraph Font"/>
     <w:uiPriority w:val="1"/>
-    <w:semiHidden/>
     <w:unhideWhenUsed/>
   </w:style>
   <w:style w:type="table" w:default="1" w:styleId="Tablanormal">

</xml_diff>